<commit_message>
court(va coa): reply-brief gated on latex (the note after a section token kept, lane 2), conclusion kept with the signature block; docx reported (LibreOffice's note placement, p10) (fb-595.54.67)
Co-Authored-By: Claude Opus 5.5 <noreply@anthropic.com>
</commit_message>
<xml_diff>
--- a/courts/fourth-circuit/virginia/state/court-of-appeals/reply-brief/usage/OUTPUT-reply-brief.docx
+++ b/courts/fourth-circuit/virginia/state/court-of-appeals/reply-brief/usage/OUTPUT-reply-brief.docx
@@ -7575,7 +7575,7 @@
     </w:p>
     <w:p>
       <w:pPr>
-        <w:pStyle w:val="BodyText"/>
+        <w:pStyle w:val="BodyTextKeep"/>
       </w:pPr>
       <w:r>
         <w:t xml:space="preserve">Appellants respectfully ask this Court to reverse the circuit court and order VADOC to produce the requested records and pay Appellants’ costs. In the alternative, to the extent necessary, the Court should vacate and remand for factfinding.</w:t>
@@ -7583,6 +7583,8 @@
     </w:p>
     <w:p>
       <w:pPr>
+        <w:keepNext/>
+        <w:keepLines/>
         <w:spacing w:before="0" w:after="0" w:line="432" w:lineRule="exact"/>
       </w:pPr>
     </w:p>
@@ -10858,6 +10860,15 @@
       <w:ind w:firstLine="0"/>
     </w:pPr>
   </w:style>
+  <w:style w:type="paragraph" w:customStyle="1" w:styleId="BodyTextKeep">
+    <w:name w:val="Body Text Keep"/>
+    <w:basedOn w:val="BodyText"/>
+    <w:qFormat/>
+    <w:pPr>
+      <w:keepNext/>
+      <w:keepLines/>
+    </w:pPr>
+  </w:style>
   <w:style w:type="paragraph" w:customStyle="1" w:styleId="XdList1">
     <w:name w:val="XdList 1"/>
     <w:basedOn w:val="Normal"/>

</xml_diff>